<commit_message>
docs: update screen design
</commit_message>
<xml_diff>
--- a/docs/design/Описание экранов.docx
+++ b/docs/design/Описание экранов.docx
@@ -24,15 +24,7 @@
           <w:sz w:val="28"/>
           <w:szCs w:val="28"/>
         </w:rPr>
-        <w:t xml:space="preserve">Главная - </w:t>
-      </w:r>
-      <w:r>
-        <w:rPr>
-          <w:rFonts w:ascii="Times New Roman" w:hAnsi="Times New Roman" w:cs="Times New Roman"/>
-          <w:sz w:val="28"/>
-          <w:szCs w:val="28"/>
-        </w:rPr>
-        <w:t>Пользователь просматривает ближайшие спортивные площадки, ищет их по названию и фильтрует по виду спорта.</w:t>
+        <w:t>Главная - Пользователь просматривает ближайшие спортивные площадки, ищет их по названию и фильтрует по виду спорта.</w:t>
       </w:r>
     </w:p>
     <w:p>
@@ -57,15 +49,7 @@
           <w:sz w:val="28"/>
           <w:szCs w:val="28"/>
         </w:rPr>
-        <w:t xml:space="preserve">Карта - </w:t>
-      </w:r>
-      <w:r>
-        <w:rPr>
-          <w:rFonts w:ascii="Times New Roman" w:hAnsi="Times New Roman" w:cs="Times New Roman"/>
-          <w:sz w:val="28"/>
-          <w:szCs w:val="28"/>
-        </w:rPr>
-        <w:t>Показывает расположение спортивных площадок на карте. Пользователь выбирает площадку и переходит к её описанию.</w:t>
+        <w:t>Карта - Показывает расположение спортивных площадок на карте. Пользователь выбирает площадку и переходит к её описанию.</w:t>
       </w:r>
     </w:p>
     <w:p>
@@ -90,15 +74,7 @@
           <w:sz w:val="28"/>
           <w:szCs w:val="28"/>
         </w:rPr>
-        <w:t xml:space="preserve">Карточка площадки - </w:t>
-      </w:r>
-      <w:r>
-        <w:rPr>
-          <w:rFonts w:ascii="Times New Roman" w:hAnsi="Times New Roman" w:cs="Times New Roman"/>
-          <w:sz w:val="28"/>
-          <w:szCs w:val="28"/>
-        </w:rPr>
-        <w:t>Отображает подробную информацию о площадке: название, адрес, фотографии, вид спорта, характеристики и отзывы.</w:t>
+        <w:t>Карточка площадки - Отображает подробную информацию о площадке: название, адрес, фотографии, вид спорта, характеристики и отзывы.</w:t>
       </w:r>
     </w:p>
     <w:p>
@@ -123,15 +99,7 @@
           <w:sz w:val="28"/>
           <w:szCs w:val="28"/>
         </w:rPr>
-        <w:t xml:space="preserve">Отзывы - </w:t>
-      </w:r>
-      <w:r>
-        <w:rPr>
-          <w:rFonts w:ascii="Times New Roman" w:hAnsi="Times New Roman" w:cs="Times New Roman"/>
-          <w:sz w:val="28"/>
-          <w:szCs w:val="28"/>
-        </w:rPr>
-        <w:t>Пользователь читает отзывы и оценки других людей о выбранной спортивной площадке.</w:t>
+        <w:t>Отзывы - Пользователь читает отзывы и оценки других людей о выбранной спортивной площадке.</w:t>
       </w:r>
     </w:p>
     <w:p>
@@ -198,15 +166,7 @@
           <w:sz w:val="28"/>
           <w:szCs w:val="28"/>
         </w:rPr>
-        <w:t xml:space="preserve"> - </w:t>
-      </w:r>
-      <w:r>
-        <w:rPr>
-          <w:rFonts w:ascii="Times New Roman" w:hAnsi="Times New Roman" w:cs="Times New Roman"/>
-          <w:sz w:val="28"/>
-          <w:szCs w:val="28"/>
-        </w:rPr>
-        <w:t>Содержит спортивные площадки, которые пользователь сохранил для быстрого доступа.</w:t>
+        <w:t xml:space="preserve"> - Содержит спортивные площадки, которые пользователь сохранил для быстрого доступа.</w:t>
       </w:r>
     </w:p>
     <w:p>
@@ -239,15 +199,7 @@
           <w:sz w:val="28"/>
           <w:szCs w:val="28"/>
         </w:rPr>
-        <w:t xml:space="preserve"> - </w:t>
-      </w:r>
-      <w:r>
-        <w:rPr>
-          <w:rFonts w:ascii="Times New Roman" w:hAnsi="Times New Roman" w:cs="Times New Roman"/>
-          <w:sz w:val="28"/>
-          <w:szCs w:val="28"/>
-        </w:rPr>
-        <w:t>Пользователь добавляет информацию о новой спортивной площадке и отправляет её на проверку модератору.</w:t>
+        <w:t xml:space="preserve"> - Пользователь добавляет информацию о новой спортивной площадке и отправляет её на проверку модератору.</w:t>
       </w:r>
     </w:p>
     <w:p>
@@ -280,15 +232,7 @@
           <w:sz w:val="28"/>
           <w:szCs w:val="28"/>
         </w:rPr>
-        <w:t xml:space="preserve"> - </w:t>
-      </w:r>
-      <w:r>
-        <w:rPr>
-          <w:rFonts w:ascii="Times New Roman" w:hAnsi="Times New Roman" w:cs="Times New Roman"/>
-          <w:sz w:val="28"/>
-          <w:szCs w:val="28"/>
-        </w:rPr>
-        <w:t>Пользователь входит в аккаунт или регистрируется, чтобы пользоваться дополнительными возможностями приложения.</w:t>
+        <w:t xml:space="preserve"> - Пользователь входит в аккаунт или регистрируется, чтобы пользоваться дополнительными возможностями приложения.</w:t>
       </w:r>
     </w:p>
     <w:p>
@@ -321,15 +265,7 @@
           <w:sz w:val="28"/>
           <w:szCs w:val="28"/>
         </w:rPr>
-        <w:t xml:space="preserve"> - </w:t>
-      </w:r>
-      <w:r>
-        <w:rPr>
-          <w:rFonts w:ascii="Times New Roman" w:hAnsi="Times New Roman" w:cs="Times New Roman"/>
-          <w:sz w:val="28"/>
-          <w:szCs w:val="28"/>
-        </w:rPr>
-        <w:t>Пользователь просматривает информацию о своём аккаунте, свои отзывы, предложенные площадки и настройки.</w:t>
+        <w:t xml:space="preserve"> - Пользователь просматривает информацию о своём аккаунте, свои отзывы, предложенные площадки и настройки.</w:t>
       </w:r>
     </w:p>
     <w:p>
@@ -362,15 +298,7 @@
           <w:sz w:val="28"/>
           <w:szCs w:val="28"/>
         </w:rPr>
-        <w:t xml:space="preserve"> - </w:t>
-      </w:r>
-      <w:r>
-        <w:rPr>
-          <w:rFonts w:ascii="Times New Roman" w:hAnsi="Times New Roman" w:cs="Times New Roman"/>
-          <w:sz w:val="28"/>
-          <w:szCs w:val="28"/>
-        </w:rPr>
-        <w:t>Модератор проверяет предложенные пользователями площадки и принимает решение: одобрить или отклонить.</w:t>
+        <w:t xml:space="preserve"> - Модератор проверяет предложенные пользователями площадки и принимает решение: одобрить или отклонить.</w:t>
       </w:r>
     </w:p>
     <w:sectPr>
@@ -1080,6 +1008,7 @@
   <w:style w:type="character" w:default="1" w:styleId="a0">
     <w:name w:val="Default Paragraph Font"/>
     <w:uiPriority w:val="1"/>
+    <w:semiHidden/>
     <w:unhideWhenUsed/>
   </w:style>
   <w:style w:type="table" w:default="1" w:styleId="a1">

</xml_diff>